<commit_message>
Added angular in MD
</commit_message>
<xml_diff>
--- a/FE/Angular.docx
+++ b/FE/Angular.docx
@@ -2315,7 +2315,7 @@
           <w:color w:val="0A0A23"/>
           <w:sz w:val="33"/>
           <w:szCs w:val="33"/>
-          <w:lang w:eastAsia="ru-RU"/>
+          <w:lang w:val="en-US" w:eastAsia="ru-RU"/>
         </w:rPr>
       </w:pPr>
       <w:r>
@@ -2369,6 +2369,7 @@
           <w:lang w:eastAsia="ru-RU"/>
         </w:rPr>
       </w:pPr>
+      <w:proofErr w:type="spellStart"/>
       <w:r>
         <w:rPr>
           <w:rFonts w:ascii="inherit" w:eastAsia="Times New Roman" w:hAnsi="inherit" w:cs="Times New Roman"/>
@@ -2380,8 +2381,37 @@
           <w:bdr w:val="none" w:sz="0" w:space="0" w:color="auto" w:frame="1"/>
           <w:lang w:eastAsia="ru-RU"/>
         </w:rPr>
-        <w:t>Attribute Directives</w:t>
-      </w:r>
+        <w:t>Attribute</w:t>
+      </w:r>
+      <w:proofErr w:type="spellEnd"/>
+      <w:r>
+        <w:rPr>
+          <w:rFonts w:ascii="inherit" w:eastAsia="Times New Roman" w:hAnsi="inherit" w:cs="Times New Roman"/>
+          <w:b/>
+          <w:bCs/>
+          <w:color w:val="0A0A23"/>
+          <w:sz w:val="33"/>
+          <w:szCs w:val="33"/>
+          <w:bdr w:val="none" w:sz="0" w:space="0" w:color="auto" w:frame="1"/>
+          <w:lang w:eastAsia="ru-RU"/>
+        </w:rPr>
+        <w:t xml:space="preserve"> </w:t>
+      </w:r>
+      <w:proofErr w:type="spellStart"/>
+      <w:r>
+        <w:rPr>
+          <w:rFonts w:ascii="inherit" w:eastAsia="Times New Roman" w:hAnsi="inherit" w:cs="Times New Roman"/>
+          <w:b/>
+          <w:bCs/>
+          <w:color w:val="0A0A23"/>
+          <w:sz w:val="33"/>
+          <w:szCs w:val="33"/>
+          <w:bdr w:val="none" w:sz="0" w:space="0" w:color="auto" w:frame="1"/>
+          <w:lang w:eastAsia="ru-RU"/>
+        </w:rPr>
+        <w:t>Directives</w:t>
+      </w:r>
+      <w:proofErr w:type="spellEnd"/>
     </w:p>
     <w:p>
       <w:pPr>
@@ -8062,6 +8092,7 @@
       </w:pPr>
       <w:r>
         <w:rPr>
+          <w:noProof/>
           <w:lang w:val="en-US"/>
         </w:rPr>
         <w:drawing>
@@ -9896,6 +9927,7 @@
       <w:r>
         <w:rPr>
           <w:rStyle w:val="Heading1Char"/>
+          <w:lang w:val="en-US"/>
         </w:rPr>
         <w:lastRenderedPageBreak/>
         <w:t>RxJS</w:t>
@@ -9918,35 +9950,19 @@
         <w:rPr>
           <w:lang w:val="en-US" w:eastAsia="ru-RU"/>
         </w:rPr>
-        <w:t xml:space="preserve">– works </w:t>
-      </w:r>
-      <w:proofErr w:type="spellStart"/>
-      <w:r>
-        <w:rPr>
-          <w:lang w:val="en-US" w:eastAsia="ru-RU"/>
-        </w:rPr>
-        <w:t>wit</w:t>
-      </w:r>
-      <w:proofErr w:type="spellEnd"/>
+        <w:t>– works with</w:t>
+      </w:r>
       <w:r>
         <w:rPr>
           <w:lang w:val="en-US" w:eastAsia="ru-RU"/>
         </w:rPr>
         <w:t xml:space="preserve"> </w:t>
       </w:r>
-      <w:proofErr w:type="spellStart"/>
-      <w:r>
-        <w:rPr>
-          <w:lang w:val="en-US" w:eastAsia="ru-RU"/>
-        </w:rPr>
-        <w:t>hstream</w:t>
-      </w:r>
-      <w:proofErr w:type="spellEnd"/>
-      <w:r>
-        <w:rPr>
-          <w:lang w:val="en-US" w:eastAsia="ru-RU"/>
-        </w:rPr>
-        <w:t xml:space="preserve"> data</w:t>
+      <w:r>
+        <w:rPr>
+          <w:lang w:val="en-US" w:eastAsia="ru-RU"/>
+        </w:rPr>
+        <w:t>stream data</w:t>
       </w:r>
     </w:p>
     <w:p>
@@ -9994,6 +10010,7 @@
       </w:r>
       <w:r>
         <w:rPr>
+          <w:noProof/>
           <w:lang w:val="en-US" w:eastAsia="ru-RU"/>
         </w:rPr>
         <w:drawing>
@@ -10465,7 +10482,7 @@
           <w:lang w:val="en-150" w:eastAsia="ru-RU"/>
         </w:rPr>
         <w:pict w14:anchorId="0D566894">
-          <v:rect id="_x0000_i1031" style="width:730.5pt;height:1.5pt" o:hrpct="0" o:hralign="center" o:hrstd="t" o:hr="t" fillcolor="#a0a0a0" stroked="f"/>
+          <v:rect id="_x0000_i1025" style="width:730.5pt;height:1.5pt" o:hrpct="0" o:hralign="center" o:hrstd="t" o:hr="t" fillcolor="#a0a0a0" stroked="f"/>
         </w:pict>
       </w:r>
     </w:p>
@@ -11258,7 +11275,7 @@
           <w:lang w:val="en-150" w:eastAsia="ru-RU"/>
         </w:rPr>
         <w:pict w14:anchorId="5D5A4F17">
-          <v:rect id="_x0000_i1057" style="width:730.5pt;height:1.5pt" o:hrpct="0" o:hralign="center" o:hrstd="t" o:hr="t" fillcolor="#a0a0a0" stroked="f"/>
+          <v:rect id="_x0000_i1026" style="width:730.5pt;height:1.5pt" o:hrpct="0" o:hralign="center" o:hrstd="t" o:hr="t" fillcolor="#a0a0a0" stroked="f"/>
         </w:pict>
       </w:r>
     </w:p>
@@ -11729,7 +11746,7 @@
           <w:lang w:val="en-150" w:eastAsia="ru-RU"/>
         </w:rPr>
         <w:pict w14:anchorId="6C9903EA">
-          <v:rect id="_x0000_i1058" style="width:730.5pt;height:1.5pt" o:hrpct="0" o:hralign="center" o:hrstd="t" o:hr="t" fillcolor="#a0a0a0" stroked="f"/>
+          <v:rect id="_x0000_i1027" style="width:730.5pt;height:1.5pt" o:hrpct="0" o:hralign="center" o:hrstd="t" o:hr="t" fillcolor="#a0a0a0" stroked="f"/>
         </w:pict>
       </w:r>
     </w:p>
@@ -11976,7 +11993,7 @@
           <w:lang w:val="en-150" w:eastAsia="ru-RU"/>
         </w:rPr>
         <w:pict w14:anchorId="45380AB0">
-          <v:rect id="_x0000_i1059" style="width:730.5pt;height:1.5pt" o:hrpct="0" o:hralign="center" o:hrstd="t" o:hr="t" fillcolor="#a0a0a0" stroked="f"/>
+          <v:rect id="_x0000_i1028" style="width:730.5pt;height:1.5pt" o:hrpct="0" o:hralign="center" o:hrstd="t" o:hr="t" fillcolor="#a0a0a0" stroked="f"/>
         </w:pict>
       </w:r>
     </w:p>
@@ -12367,7 +12384,7 @@
           <w:lang w:val="en-150" w:eastAsia="ru-RU"/>
         </w:rPr>
         <w:pict w14:anchorId="11FEE452">
-          <v:rect id="_x0000_i1060" style="width:730.5pt;height:1.5pt" o:hrpct="0" o:hralign="center" o:hrstd="t" o:hr="t" fillcolor="#a0a0a0" stroked="f"/>
+          <v:rect id="_x0000_i1029" style="width:730.5pt;height:1.5pt" o:hrpct="0" o:hralign="center" o:hrstd="t" o:hr="t" fillcolor="#a0a0a0" stroked="f"/>
         </w:pict>
       </w:r>
     </w:p>
@@ -12573,7 +12590,7 @@
       <w:pPr>
         <w:spacing w:after="0" w:line="240" w:lineRule="auto"/>
         <w:rPr>
-          <w:lang w:eastAsia="ru-RU"/>
+          <w:lang w:val="en-US" w:eastAsia="ru-RU"/>
         </w:rPr>
       </w:pPr>
     </w:p>
@@ -12581,7 +12598,7 @@
       <w:pPr>
         <w:spacing w:after="0" w:line="240" w:lineRule="auto"/>
         <w:rPr>
-          <w:lang w:eastAsia="ru-RU"/>
+          <w:lang w:val="en-US" w:eastAsia="ru-RU"/>
         </w:rPr>
       </w:pPr>
     </w:p>
@@ -15275,6 +15292,7 @@
   <w:style w:type="character" w:default="1" w:styleId="DefaultParagraphFont">
     <w:name w:val="Default Paragraph Font"/>
     <w:uiPriority w:val="1"/>
+    <w:semiHidden/>
     <w:unhideWhenUsed/>
   </w:style>
   <w:style w:type="table" w:default="1" w:styleId="TableNormal">

</xml_diff>